<commit_message>
docs: update Manual Usuario + Business Plan with session 26-28 features
Manual Usuario:
- Add section 18: Calculadora Umbrales Contables
- Add section 18b: Obligaciones Fiscales por Perfil
- Add section 18c: Farmacias (RE, deducciones, clasificador)

Business Plan:
- Add 4.8: 6 calculadoras publicas (lead magnets SEO)
- Add 4.9: Segmento Farmacias (RE, fondo comercio, 6 deducciones)
- Add 4.10: Auditoria Seguridad (21 issues, 20 resueltos, score 9/10)
- Add 4.11: PageSpeed optimization (69→85+)
- Update metrics: ~1758 tests, 456+ docs
</commit_message>
<xml_diff>
--- a/plans/Impuestify_Business_Plan_2026.docx
+++ b/plans/Impuestify_Business_Plan_2026.docx
@@ -2295,6 +2295,110 @@
     </w:p>
     <w:p>
       <w:pPr>
+        <w:pStyle w:val="Heading2"/>
+      </w:pPr>
+      <w:r>
+        <w:t>4.8 Calculadoras Publicas (6 herramientas gratuitas)</w:t>
+      </w:r>
+    </w:p>
+    <w:p>
+      <w:pPr/>
+      <w:r>
+        <w:t>Impuestify ofrece 6 calculadoras publicas como herramientas de captacion (lead magnets SEO):</w:t>
+      </w:r>
+    </w:p>
+    <w:p>
+      <w:pPr/>
+      <w:r>
+        <w:t>1. Calculadora de Retenciones IRPF (/calculadora-retenciones): algoritmo oficial AEAT 2026, 28 tests.</w:t>
+      </w:r>
+    </w:p>
+    <w:p>
+      <w:pPr/>
+      <w:r>
+        <w:t>2. Calculadora Sueldo Neto Autonomo (/calculadora-neto): 5 regimenes fiscales (Madrid, Canarias IGIC, Melilla IPSI, Pais Vasco, Navarra), 21 tests.</w:t>
+      </w:r>
+    </w:p>
+    <w:p>
+      <w:pPr/>
+      <w:r>
+        <w:t>3. Calculadora Umbrales Contables (/calculadora-umbrales): PGC Normal vs PYMES, necesidad de auditoria segun LSC.</w:t>
+      </w:r>
+    </w:p>
+    <w:p>
+      <w:pPr/>
+      <w:r>
+        <w:t>4. Obligaciones Fiscales (/modelos-obligatorios): modelos a presentar segun perfil, CCAA y actividad.</w:t>
+      </w:r>
+    </w:p>
+    <w:p>
+      <w:pPr/>
+      <w:r>
+        <w:t>5. Obligado a Declarar (/obligado-declarar): Art. 96 LIRPF, umbrales por pagadores.</w:t>
+      </w:r>
+    </w:p>
+    <w:p>
+      <w:pPr/>
+      <w:r>
+        <w:t>6. Checklist Borrador Renta (/checklist-borrador): verificacion pre-declaracion.</w:t>
+      </w:r>
+    </w:p>
+    <w:p>
+      <w:pPr>
+        <w:pStyle w:val="Heading2"/>
+      </w:pPr>
+      <w:r>
+        <w:t>4.9 Segmento Farmacias</w:t>
+      </w:r>
+    </w:p>
+    <w:p>
+      <w:pPr/>
+      <w:r>
+        <w:t>Soporte especializado para farmaceuticos titulares (IAE 652.1): Recargo de Equivalencia automatico (Art. 154-163 LIVA), fondo de comercio (Art. 12.6 LIS), 6 deducciones especificas, clasificacion PGC automatica de facturas de distribuidoras (Cofares, Alliance Healthcare).</w:t>
+      </w:r>
+    </w:p>
+    <w:p>
+      <w:pPr/>
+      <w:r>
+        <w:t>Coste marginal de atencion por farmacia: ~0 EUR (RAG + deducciones seeded, sin intervencion humana).</w:t>
+      </w:r>
+    </w:p>
+    <w:p>
+      <w:pPr>
+        <w:pStyle w:val="Heading2"/>
+      </w:pPr>
+      <w:r>
+        <w:t>4.10 Auditoria de Seguridad (Sesion 28)</w:t>
+      </w:r>
+    </w:p>
+    <w:p>
+      <w:pPr/>
+      <w:r>
+        <w:t>Auditoria completa del backend: 21 issues identificados, 20 resueltos. 4 CRITICAL (SQL injection, auth bypass, JWT exposure, test endpoints en produccion), 4 HIGH (JWT validation, code dedup, datetime migration), 5 MEDIUM, 7 LOW. Score de calidad: 7/10 -&gt; 9/10.</w:t>
+      </w:r>
+    </w:p>
+    <w:p>
+      <w:pPr/>
+      <w:r>
+        <w:t>13 capas de seguridad activas: rate limiting, JWT, CAPTCHA, MFA/2FA, prompt injection, PII, SQL injection, content moderation, content restriction, semantic cache, guardrails, audit logger, document integrity scanner.</w:t>
+      </w:r>
+    </w:p>
+    <w:p>
+      <w:pPr>
+        <w:pStyle w:val="Heading2"/>
+      </w:pPr>
+      <w:r>
+        <w:t>4.11 Rendimiento Web (PageSpeed)</w:t>
+      </w:r>
+    </w:p>
+    <w:p>
+      <w:pPr/>
+      <w:r>
+        <w:t>Optimizacion PageSpeed Insights mobile: 69 -&gt; 85+ (estimado). Hero image reducido 88% (234KB -&gt; 27KB), lazy loading de 5 paginas principales, cache headers inmutables para assets, carga de fuentes no bloqueante.</w:t>
+      </w:r>
+    </w:p>
+    <w:p>
+      <w:pPr>
         <w:pStyle w:val="Heading1"/>
       </w:pPr>
       <w:r>

</xml_diff>

<commit_message>
docs: add Modelo 308 to Manual Usuario + Business Plan (13 tools)
</commit_message>
<xml_diff>
--- a/plans/Impuestify_Business_Plan_2026.docx
+++ b/plans/Impuestify_Business_Plan_2026.docx
@@ -2364,6 +2364,12 @@
       </w:r>
     </w:p>
     <w:p>
+      <w:pPr/>
+      <w:r>
+        <w:t>Modelo 308 integrado: calculadora de devolucion RE para adquisiciones intracomunitarias e inversion del sujeto pasivo. 13 tools fiscales totales (antes 12). 33 tests nuevos.</w:t>
+      </w:r>
+    </w:p>
+    <w:p>
       <w:pPr>
         <w:pStyle w:val="Heading2"/>
       </w:pPr>

</xml_diff>